<commit_message>
Polish DOCX export: styles, table layout, draft watermark
Rely on template Title/Heading1/Heading2/Normal/TableGrid (styleExist
test); split LLM text on newlines; hours table uses TableGrid with
borders and a wider first column. Draft exports get «ЧЕРНОВИК»;
validated/exported stay clean. EXPORTED allows return to editing.
Also: yml /v1/content comment, HttpTimeoutException cause detection,
AsyncConfig virtual-threads comment clarified.

Co-authored-by: danjos91 <dannyjos@yandex.ru>
</commit_message>
<xml_diff>
--- a/java-service/src/main/resources/templates/program-template.docx
+++ b/java-service/src/main/resources/templates/program-template.docx
@@ -22,36 +22,109 @@
 
 <file path=word/styles.xml><?xml version="1.0" encoding="utf-8"?>
 <w:styles xmlns:w="http://schemas.openxmlformats.org/wordprocessingml/2006/main">
-  <w:style w:type="paragraph" w:styleId="Title" w:default="0">
+  <w:docDefaults>
+    <w:rPrDefault>
+      <w:rPr>
+        <w:rFonts w:ascii="Times New Roman" w:hAnsi="Times New Roman" w:cs="Times New Roman"/>
+        <w:sz w:val="22"/>
+        <w:szCs w:val="22"/>
+      </w:rPr>
+    </w:rPrDefault>
+    <w:pPrDefault>
+      <w:pPr>
+        <w:spacing w:after="120" w:line="276" w:lineRule="auto"/>
+      </w:pPr>
+    </w:pPrDefault>
+  </w:docDefaults>
+  <w:style w:type="paragraph" w:styleId="Normal" w:default="1">
+    <w:name w:val="Normal"/>
+    <w:qFormat/>
+    <w:rPr>
+      <w:rFonts w:ascii="Times New Roman" w:hAnsi="Times New Roman"/>
+      <w:sz w:val="22"/>
+      <w:szCs w:val="22"/>
+    </w:rPr>
+  </w:style>
+  <w:style w:type="paragraph" w:styleId="Title">
     <w:name w:val="Title"/>
+    <w:basedOn w:val="Normal"/>
+    <w:next w:val="Normal"/>
+    <w:qFormat/>
+    <w:pPr>
+      <w:jc w:val="center"/>
+      <w:spacing w:before="240" w:after="240"/>
+    </w:pPr>
     <w:rPr>
       <w:b/>
       <w:sz w:val="36"/>
+      <w:szCs w:val="36"/>
       <w:color w:val="0F6B5C"/>
     </w:rPr>
   </w:style>
   <w:style w:type="paragraph" w:styleId="Heading1">
     <w:name w:val="heading 1"/>
     <w:basedOn w:val="Normal"/>
+    <w:next w:val="Normal"/>
+    <w:uiPriority w:val="9"/>
+    <w:qFormat/>
+    <w:pPr>
+      <w:keepNext/>
+      <w:spacing w:before="360" w:after="160"/>
+      <w:outlineLvl w:val="0"/>
+    </w:pPr>
     <w:rPr>
       <w:b/>
       <w:sz w:val="28"/>
+      <w:szCs w:val="28"/>
       <w:color w:val="1A2332"/>
     </w:rPr>
   </w:style>
   <w:style w:type="paragraph" w:styleId="Heading2">
     <w:name w:val="heading 2"/>
+    <w:basedOn w:val="Normal"/>
+    <w:next w:val="Normal"/>
+    <w:uiPriority w:val="9"/>
+    <w:qFormat/>
+    <w:pPr>
+      <w:keepNext/>
+      <w:spacing w:before="240" w:after="120"/>
+      <w:outlineLvl w:val="1"/>
+    </w:pPr>
     <w:rPr>
       <w:b/>
       <w:sz w:val="24"/>
+      <w:szCs w:val="24"/>
       <w:color w:val="0F6B5C"/>
     </w:rPr>
   </w:style>
-  <w:style w:type="paragraph" w:styleId="Normal" w:default="1">
-    <w:name w:val="Normal"/>
-    <w:rPr>
-      <w:sz w:val="22"/>
-    </w:rPr>
+  <w:style w:type="table" w:styleId="TableGrid">
+    <w:name w:val="Table Grid"/>
+    <w:basedOn w:val="TableNormal"/>
+    <w:uiPriority w:val="39"/>
+    <w:tblPr>
+      <w:tblBorders>
+        <w:top w:val="single" w:sz="4" w:space="0" w:color="666666"/>
+        <w:left w:val="single" w:sz="4" w:space="0" w:color="666666"/>
+        <w:bottom w:val="single" w:sz="4" w:space="0" w:color="666666"/>
+        <w:right w:val="single" w:sz="4" w:space="0" w:color="666666"/>
+        <w:insideH w:val="single" w:sz="4" w:space="0" w:color="666666"/>
+        <w:insideV w:val="single" w:sz="4" w:space="0" w:color="666666"/>
+      </w:tblBorders>
+    </w:tblPr>
+  </w:style>
+  <w:style w:type="table" w:styleId="TableNormal" w:default="1">
+    <w:name w:val="Normal Table"/>
+    <w:semiHidden/>
+    <w:unhideWhenUsed/>
+    <w:tblPr>
+      <w:tblInd w:w="0" w:type="dxa"/>
+      <w:tblCellMar>
+        <w:top w:w="0" w:type="dxa"/>
+        <w:left w:w="108" w:type="dxa"/>
+        <w:bottom w:w="0" w:type="dxa"/>
+        <w:right w:w="108" w:type="dxa"/>
+      </w:tblCellMar>
+    </w:tblPr>
   </w:style>
 </w:styles>
 </file>
</xml_diff>